<commit_message>
Update portfolio: add VS Code settings and update resume
</commit_message>
<xml_diff>
--- a/Resume.docx
+++ b/Resume.docx
@@ -65,19 +65,7 @@
           <w:rPr>
             <w:rStyle w:val="Hyperlink"/>
           </w:rPr>
-          <w:t>Gi</w:t>
-        </w:r>
-        <w:r>
-          <w:rPr>
-            <w:rStyle w:val="Hyperlink"/>
-          </w:rPr>
-          <w:t>t</w:t>
-        </w:r>
-        <w:r>
-          <w:rPr>
-            <w:rStyle w:val="Hyperlink"/>
-          </w:rPr>
-          <w:t>Hub</w:t>
+          <w:t>GitHub</w:t>
         </w:r>
       </w:hyperlink>
       <w:r>
@@ -88,26 +76,9 @@
           <w:rPr>
             <w:rStyle w:val="Hyperlink"/>
           </w:rPr>
-          <w:t>Portf</w:t>
-        </w:r>
-        <w:r>
-          <w:rPr>
-            <w:rStyle w:val="Hyperlink"/>
-          </w:rPr>
-          <w:t>o</w:t>
-        </w:r>
-        <w:r>
-          <w:rPr>
-            <w:rStyle w:val="Hyperlink"/>
-          </w:rPr>
-          <w:t>lio</w:t>
+          <w:t>Portfolio</w:t>
         </w:r>
       </w:hyperlink>
-    </w:p>
-    <w:p>
-      <w:pPr>
-        <w:jc w:val="center"/>
-      </w:pPr>
     </w:p>
     <w:p>
       <w:pPr>
@@ -128,7 +99,7 @@
     <w:p>
       <w:r>
         <w:pict w14:anchorId="227A2EF2">
-          <v:rect id="_x0000_i1073" style="width:0;height:1.5pt" o:hralign="center" o:hrstd="t" o:hr="t" fillcolor="#a0a0a0" stroked="f"/>
+          <v:rect id="_x0000_i1025" style="width:0;height:1.5pt" o:hralign="center" o:hrstd="t" o:hr="t" fillcolor="#a0a0a0" stroked="f"/>
         </w:pict>
       </w:r>
     </w:p>
@@ -156,7 +127,7 @@
     <w:p>
       <w:r>
         <w:pict w14:anchorId="4467B5C8">
-          <v:rect id="_x0000_i1074" style="width:0;height:1.5pt" o:hralign="center" o:hrstd="t" o:hr="t" fillcolor="#a0a0a0" stroked="f"/>
+          <v:rect id="_x0000_i1026" style="width:0;height:1.5pt" o:hralign="center" o:hrstd="t" o:hr="t" fillcolor="#a0a0a0" stroked="f"/>
         </w:pict>
       </w:r>
     </w:p>
@@ -166,25 +137,23 @@
           <w:b/>
           <w:bCs/>
         </w:rPr>
-        <w:t xml:space="preserve">AMITY </w:t>
-      </w:r>
-      <w:proofErr w:type="spellStart"/>
+        <w:t>AMITY UNIVERSITY</w:t>
+      </w:r>
       <w:r>
         <w:rPr>
           <w:b/>
           <w:bCs/>
         </w:rPr>
-        <w:t>UNIVERSITY</w:t>
-      </w:r>
-      <w:r>
-        <w:t>Aug</w:t>
-      </w:r>
-      <w:proofErr w:type="spellEnd"/>
-      <w:r>
-        <w:t xml:space="preserve"> 2024 - June 202</w:t>
+        <w:t xml:space="preserve"> (</w:t>
+      </w:r>
+      <w:r>
+        <w:t>Aug 2024 - June 202</w:t>
       </w:r>
       <w:r>
         <w:t>7</w:t>
+      </w:r>
+      <w:r>
+        <w:t>)</w:t>
       </w:r>
     </w:p>
     <w:p>
@@ -207,10 +176,21 @@
         <w:t>5.6</w:t>
       </w:r>
       <w:r>
-        <w:t xml:space="preserve"> | 3rd Sem SGPA: </w:t>
-      </w:r>
-      <w:r>
-        <w:t>5.5</w:t>
+        <w:t xml:space="preserve"> | </w:t>
+      </w:r>
+      <w:proofErr w:type="gramStart"/>
+      <w:r>
+        <w:t>2 year</w:t>
+      </w:r>
+      <w:proofErr w:type="gramEnd"/>
+      <w:r>
+        <w:t xml:space="preserve"> C</w:t>
+      </w:r>
+      <w:r>
+        <w:t xml:space="preserve">GPA: </w:t>
+      </w:r>
+      <w:r>
+        <w:t>6.5</w:t>
       </w:r>
     </w:p>
     <w:p>
@@ -232,7 +212,7 @@
     <w:p>
       <w:r>
         <w:pict w14:anchorId="59B59884">
-          <v:rect id="_x0000_i1075" style="width:0;height:1.5pt" o:hralign="center" o:hrstd="t" o:hr="t" fillcolor="#a0a0a0" stroked="f"/>
+          <v:rect id="_x0000_i1027" style="width:0;height:1.5pt" o:hralign="center" o:hrstd="t" o:hr="t" fillcolor="#a0a0a0" stroked="f"/>
         </w:pict>
       </w:r>
     </w:p>
@@ -320,24 +300,6 @@
           <w:b/>
           <w:bCs/>
         </w:rPr>
-        <w:t>Soft Skills &amp; Core Competencies:</w:t>
-      </w:r>
-      <w:r>
-        <w:t> Team Management, Technical Leadership, Critical Decision Making, Agility, Creative Thinking, Emotional Intelligence [cite: 20]</w:t>
-      </w:r>
-    </w:p>
-    <w:p>
-      <w:pPr>
-        <w:numPr>
-          <w:ilvl w:val="0"/>
-          <w:numId w:val="1"/>
-        </w:numPr>
-      </w:pPr>
-      <w:r>
-        <w:rPr>
-          <w:b/>
-          <w:bCs/>
-        </w:rPr>
         <w:t>Languages Spoken:</w:t>
       </w:r>
       <w:r>
@@ -363,7 +325,7 @@
     <w:p>
       <w:r>
         <w:pict w14:anchorId="26A8D825">
-          <v:rect id="_x0000_i1076" style="width:0;height:1.5pt" o:hralign="center" o:hrstd="t" o:hr="t" fillcolor="#a0a0a0" stroked="f"/>
+          <v:rect id="_x0000_i1028" style="width:0;height:1.5pt" o:hralign="center" o:hrstd="t" o:hr="t" fillcolor="#a0a0a0" stroked="f"/>
         </w:pict>
       </w:r>
     </w:p>
@@ -430,7 +392,6 @@
         </w:numPr>
       </w:pPr>
       <w:r>
-        <w:lastRenderedPageBreak/>
         <w:t xml:space="preserve">Completed an intensive two-month technical internship focusing on full-stack web architectures and core network security </w:t>
       </w:r>
       <w:proofErr w:type="gramStart"/>
@@ -463,6 +424,7 @@
     </w:p>
     <w:p>
       <w:pPr>
+        <w:ind w:left="720"/>
         <w:jc w:val="center"/>
       </w:pPr>
       <w:r>
@@ -470,13 +432,14 @@
           <w:b/>
           <w:bCs/>
         </w:rPr>
+        <w:lastRenderedPageBreak/>
         <w:t>Projects</w:t>
       </w:r>
     </w:p>
     <w:p>
       <w:r>
         <w:pict w14:anchorId="3678D544">
-          <v:rect id="_x0000_i1077" style="width:0;height:1.5pt" o:hralign="center" o:hrstd="t" o:hr="t" fillcolor="#a0a0a0" stroked="f"/>
+          <v:rect id="_x0000_i1029" style="width:0;height:1.5pt" o:hralign="center" o:hrstd="t" o:hr="t" fillcolor="#a0a0a0" stroked="f"/>
         </w:pict>
       </w:r>
     </w:p>
@@ -487,6 +450,16 @@
           <w:bCs/>
         </w:rPr>
         <w:t>Course Management System</w:t>
+      </w:r>
+      <w:r>
+        <w:rPr>
+          <w:b/>
+          <w:bCs/>
+        </w:rPr>
+        <w:t xml:space="preserve"> </w:t>
+      </w:r>
+      <w:r>
+        <w:t>(Group Project)</w:t>
       </w:r>
       <w:r>
         <w:rPr>
@@ -512,23 +485,7 @@
         </w:numPr>
       </w:pPr>
       <w:r>
-        <w:t xml:space="preserve">Built a modular desktop-based architecture using Python, </w:t>
-      </w:r>
-      <w:proofErr w:type="spellStart"/>
-      <w:r>
-        <w:t>Tkinter</w:t>
-      </w:r>
-      <w:proofErr w:type="spellEnd"/>
-      <w:r>
-        <w:t xml:space="preserve">, and an SQLite database to automate administrative </w:t>
-      </w:r>
-      <w:proofErr w:type="gramStart"/>
-      <w:r>
-        <w:t>workflows[</w:t>
-      </w:r>
-      <w:proofErr w:type="gramEnd"/>
-      <w:r>
-        <w:t>cite: 60].</w:t>
+        <w:t>Built a modular desktop-based architecture using Python, and an SQLite database to automate administrative workflows.</w:t>
       </w:r>
     </w:p>
     <w:p>
@@ -539,15 +496,7 @@
         </w:numPr>
       </w:pPr>
       <w:r>
-        <w:t xml:space="preserve">Implemented strict role-based authentication rules to distinguish and manage access layers for admins, instructors, and </w:t>
-      </w:r>
-      <w:proofErr w:type="gramStart"/>
-      <w:r>
-        <w:t>students[</w:t>
-      </w:r>
-      <w:proofErr w:type="gramEnd"/>
-      <w:r>
-        <w:t>cite: 60].</w:t>
+        <w:t>Implemented strict role-based authentication rules to distinguish and manage access layers for admins, instructors, and students.</w:t>
       </w:r>
     </w:p>
     <w:p>
@@ -557,6 +506,16 @@
           <w:bCs/>
         </w:rPr>
         <w:t>Feature-Rich Utility Application</w:t>
+      </w:r>
+      <w:r>
+        <w:rPr>
+          <w:b/>
+          <w:bCs/>
+        </w:rPr>
+        <w:t xml:space="preserve"> </w:t>
+      </w:r>
+      <w:r>
+        <w:t>(Group Project)</w:t>
       </w:r>
       <w:r>
         <w:rPr>
@@ -582,15 +541,10 @@
         </w:numPr>
       </w:pPr>
       <w:r>
-        <w:t xml:space="preserve">Engineered an interactive Android application natively in Java using Android Studio and Firebase for secure user authentication and data </w:t>
-      </w:r>
-      <w:proofErr w:type="gramStart"/>
-      <w:r>
-        <w:t>persistence[</w:t>
-      </w:r>
-      <w:proofErr w:type="gramEnd"/>
-      <w:r>
-        <w:t>cite: 56].</w:t>
+        <w:t>Engineered an interactive Android application natively in Java using Android Studio and Firebase for secure user authentication and data persistence</w:t>
+      </w:r>
+      <w:r>
+        <w:t>.</w:t>
       </w:r>
     </w:p>
     <w:p>
@@ -601,46 +555,45 @@
         </w:numPr>
       </w:pPr>
       <w:r>
-        <w:t xml:space="preserve">Integrated system-level hardware capabilities including camera controllers, media playbacks, Bluetooth/Wi-Fi toggles, and device </w:t>
-      </w:r>
-      <w:proofErr w:type="gramStart"/>
-      <w:r>
-        <w:t>sensors[</w:t>
-      </w:r>
-      <w:proofErr w:type="gramEnd"/>
-      <w:r>
-        <w:t>cite: 57].</w:t>
+        <w:t>Integrated system-level hardware capabilities including camera controllers, media playbacks, Bluetooth/Wi-Fi toggles, and device sensors.</w:t>
       </w:r>
     </w:p>
     <w:p>
+      <w:proofErr w:type="spellStart"/>
       <w:r>
         <w:rPr>
           <w:b/>
           <w:bCs/>
         </w:rPr>
-        <w:t xml:space="preserve">Student/Admin Management </w:t>
-      </w:r>
-      <w:proofErr w:type="spellStart"/>
+        <w:t>Vittora</w:t>
+      </w:r>
+      <w:proofErr w:type="spellEnd"/>
       <w:r>
         <w:rPr>
           <w:b/>
           <w:bCs/>
         </w:rPr>
-        <w:t>System</w:t>
+        <w:t xml:space="preserve"> AI</w:t>
+      </w:r>
+      <w:r>
+        <w:rPr>
+          <w:b/>
+          <w:bCs/>
+        </w:rPr>
+        <w:t xml:space="preserve"> </w:t>
+      </w:r>
+      <w:r>
+        <w:t>(Group Project)</w:t>
+      </w:r>
+      <w:r>
+        <w:t xml:space="preserve"> </w:t>
       </w:r>
       <w:hyperlink r:id="rId11" w:history="1">
         <w:r>
           <w:rPr>
             <w:rStyle w:val="Hyperlink"/>
           </w:rPr>
-          <w:t>GitHub</w:t>
-        </w:r>
-        <w:proofErr w:type="spellEnd"/>
-        <w:r>
-          <w:rPr>
-            <w:rStyle w:val="Hyperlink"/>
-          </w:rPr>
-          <w:t xml:space="preserve"> Link</w:t>
+          <w:t>GitHub Link</w:t>
         </w:r>
       </w:hyperlink>
     </w:p>
@@ -652,15 +605,7 @@
         </w:numPr>
       </w:pPr>
       <w:r>
-        <w:t xml:space="preserve">Designed a multi-role PHP and MySQL relational web application structured securely on a local WampServer </w:t>
-      </w:r>
-      <w:proofErr w:type="gramStart"/>
-      <w:r>
-        <w:t>architecture[</w:t>
-      </w:r>
-      <w:proofErr w:type="gramEnd"/>
-      <w:r>
-        <w:t>cite: 52, 54].</w:t>
+        <w:t>Designed a multi-role PHP and MySQL relational web application structured securely on a local WampServer architecture.</w:t>
       </w:r>
     </w:p>
     <w:p>
@@ -671,15 +616,7 @@
         </w:numPr>
       </w:pPr>
       <w:r>
-        <w:t xml:space="preserve">Embedded client-side data validations using JavaScript to safeguard entry mechanisms and optimize database </w:t>
-      </w:r>
-      <w:proofErr w:type="gramStart"/>
-      <w:r>
-        <w:t>accuracy[</w:t>
-      </w:r>
-      <w:proofErr w:type="gramEnd"/>
-      <w:r>
-        <w:t>cite: 53].</w:t>
+        <w:t>Embedded client-side data validations using JavaScript to safeguard entry mechanisms and optimize database accuracy.</w:t>
       </w:r>
     </w:p>
     <w:p>
@@ -688,69 +625,57 @@
           <w:b/>
           <w:bCs/>
         </w:rPr>
-        <w:t xml:space="preserve">Network Management </w:t>
-      </w:r>
-      <w:proofErr w:type="spellStart"/>
+        <w:t>Portfolio</w:t>
+      </w:r>
       <w:r>
         <w:rPr>
           <w:b/>
           <w:bCs/>
         </w:rPr>
-        <w:t>Infrastructure</w:t>
+        <w:t xml:space="preserve"> </w:t>
       </w:r>
       <w:hyperlink r:id="rId12" w:history="1">
         <w:r>
           <w:rPr>
             <w:rStyle w:val="Hyperlink"/>
           </w:rPr>
-          <w:t>GitHub</w:t>
-        </w:r>
-        <w:proofErr w:type="spellEnd"/>
-        <w:r>
-          <w:rPr>
-            <w:rStyle w:val="Hyperlink"/>
-          </w:rPr>
-          <w:t xml:space="preserve"> Link</w:t>
+          <w:t>GitHub Link</w:t>
         </w:r>
       </w:hyperlink>
     </w:p>
     <w:p>
       <w:pPr>
+        <w:pStyle w:val="ListParagraph"/>
         <w:numPr>
           <w:ilvl w:val="0"/>
-          <w:numId w:val="7"/>
+          <w:numId w:val="21"/>
         </w:numPr>
       </w:pPr>
       <w:r>
-        <w:t xml:space="preserve">Configured an enterprise-grade ecosystem using Red Hat Enterprise Linux (RHEL) to manage underlying IT </w:t>
-      </w:r>
-      <w:proofErr w:type="gramStart"/>
-      <w:r>
-        <w:t>environments[</w:t>
-      </w:r>
-      <w:proofErr w:type="gramEnd"/>
-      <w:r>
-        <w:t>cite: 48, 50].</w:t>
+        <w:t>Built a personal portfolio website using HTML and CSS, focusing on responsive design and user experience.</w:t>
       </w:r>
     </w:p>
     <w:p>
       <w:pPr>
+        <w:pStyle w:val="ListParagraph"/>
+      </w:pPr>
+    </w:p>
+    <w:p>
+      <w:pPr>
+        <w:pStyle w:val="ListParagraph"/>
         <w:numPr>
           <w:ilvl w:val="0"/>
-          <w:numId w:val="7"/>
+          <w:numId w:val="21"/>
         </w:numPr>
       </w:pPr>
       <w:r>
-        <w:t xml:space="preserve">Provisioned custom local network domains, subdomains, explicit access rules, and structural privilege </w:t>
-      </w:r>
-      <w:proofErr w:type="gramStart"/>
-      <w:r>
-        <w:t>delegations[</w:t>
-      </w:r>
-      <w:proofErr w:type="gramEnd"/>
-      <w:r>
-        <w:t>cite: 49, 50].</w:t>
-      </w:r>
+        <w:t>Managed the codebase with Git and deployed it on GitHub to showcase my work online.</w:t>
+      </w:r>
+    </w:p>
+    <w:p>
+      <w:pPr>
+        <w:pStyle w:val="ListParagraph"/>
+      </w:pPr>
     </w:p>
     <w:p>
       <w:r>
@@ -758,64 +683,102 @@
           <w:b/>
           <w:bCs/>
         </w:rPr>
-        <w:t xml:space="preserve">Cryptographic Cryptanalysis &amp; Security Tools </w:t>
-      </w:r>
-      <w:proofErr w:type="spellStart"/>
+        <w:t>Smart Attendence</w:t>
+      </w:r>
       <w:r>
         <w:rPr>
           <w:b/>
           <w:bCs/>
         </w:rPr>
-        <w:t>Suite</w:t>
+        <w:t xml:space="preserve"> </w:t>
+      </w:r>
+      <w:r>
+        <w:t>(Group Project)</w:t>
+      </w:r>
+      <w:r>
+        <w:rPr>
+          <w:b/>
+          <w:bCs/>
+        </w:rPr>
+        <w:t xml:space="preserve"> </w:t>
       </w:r>
       <w:hyperlink r:id="rId13" w:history="1">
         <w:r>
           <w:rPr>
             <w:rStyle w:val="Hyperlink"/>
           </w:rPr>
-          <w:t>GitHub</w:t>
+          <w:t>Git</w:t>
         </w:r>
-        <w:proofErr w:type="spellEnd"/>
         <w:r>
           <w:rPr>
             <w:rStyle w:val="Hyperlink"/>
           </w:rPr>
-          <w:t xml:space="preserve"> Link</w:t>
+          <w:t>Hub Link</w:t>
         </w:r>
       </w:hyperlink>
     </w:p>
     <w:p>
       <w:pPr>
+        <w:pStyle w:val="ListParagraph"/>
         <w:numPr>
           <w:ilvl w:val="0"/>
-          <w:numId w:val="8"/>
+          <w:numId w:val="23"/>
         </w:numPr>
       </w:pPr>
       <w:r>
+        <w:t>Developed a Smart Attendance System during a hackathon to automate attendance recording and improve accuracy.</w:t>
+      </w:r>
+    </w:p>
+    <w:p>
+      <w:pPr>
+        <w:pStyle w:val="ListParagraph"/>
+      </w:pPr>
+    </w:p>
+    <w:p>
+      <w:pPr>
+        <w:pStyle w:val="ListParagraph"/>
+        <w:numPr>
+          <w:ilvl w:val="0"/>
+          <w:numId w:val="23"/>
+        </w:numPr>
+      </w:pPr>
+      <w:r>
+        <w:t>Collaborated in a team to design and implement the solution, focusing on efficiency and real-world usability</w:t>
+      </w:r>
+    </w:p>
+    <w:p>
+      <w:pPr>
         <w:rPr>
           <w:b/>
           <w:bCs/>
         </w:rPr>
-        <w:t>Image Encryption Tool:</w:t>
-      </w:r>
-      <w:r>
-        <w:t xml:space="preserve"> Programmed a pixel manipulation engine in Python enforcing pixel swapping and math operations for </w:t>
-      </w:r>
-      <w:proofErr w:type="gramStart"/>
-      <w:r>
-        <w:t>privacy[</w:t>
-      </w:r>
-      <w:proofErr w:type="gramEnd"/>
-      <w:r>
-        <w:t>cite: 39, 40].</w:t>
-      </w:r>
+      </w:pPr>
     </w:p>
     <w:p>
       <w:pPr>
-        <w:numPr>
-          <w:ilvl w:val="0"/>
-          <w:numId w:val="8"/>
-        </w:numPr>
+        <w:jc w:val="center"/>
+        <w:rPr>
+          <w:b/>
+          <w:bCs/>
+        </w:rPr>
+      </w:pPr>
+    </w:p>
+    <w:p>
+      <w:pPr>
+        <w:jc w:val="center"/>
+        <w:rPr>
+          <w:b/>
+          <w:bCs/>
+        </w:rPr>
+      </w:pPr>
+    </w:p>
+    <w:p>
+      <w:pPr>
+        <w:jc w:val="center"/>
+        <w:rPr>
+          <w:b/>
+          <w:bCs/>
+        </w:rPr>
       </w:pPr>
       <w:r>
         <w:rPr>
@@ -823,25 +786,22 @@
           <w:bCs/>
         </w:rPr>
         <w:lastRenderedPageBreak/>
-        <w:t>Password Strength Analyzer:</w:t>
-      </w:r>
-      <w:r>
-        <w:t xml:space="preserve"> Coded an evaluator assessing complexity matrices like length, character diversity, and </w:t>
-      </w:r>
-      <w:proofErr w:type="gramStart"/>
-      <w:r>
-        <w:t>symbols[</w:t>
-      </w:r>
-      <w:proofErr w:type="gramEnd"/>
-      <w:r>
-        <w:t>cite: 42].</w:t>
+        <w:t>Accomplishments &amp; Hackathons</w:t>
       </w:r>
     </w:p>
     <w:p>
-      <w:pPr>
+      <w:r>
+        <w:pict w14:anchorId="549A52AA">
+          <v:rect id="_x0000_i1030" style="width:0;height:1.5pt" o:hralign="center" o:hrstd="t" o:hr="t" fillcolor="#a0a0a0" stroked="f"/>
+        </w:pict>
+      </w:r>
+    </w:p>
+    <w:p>
+      <w:pPr>
+        <w:pStyle w:val="ListParagraph"/>
         <w:numPr>
           <w:ilvl w:val="0"/>
-          <w:numId w:val="8"/>
+          <w:numId w:val="18"/>
         </w:numPr>
       </w:pPr>
       <w:r>
@@ -849,45 +809,36 @@
           <w:b/>
           <w:bCs/>
         </w:rPr>
-        <w:t>Controlled Keylogger:</w:t>
-      </w:r>
-      <w:r>
-        <w:t xml:space="preserve"> Built an isolated file-logging tool to track keystrokes safely for threat </w:t>
+        <w:t>Internal Smart India Hackathon 2025:</w:t>
+      </w:r>
+      <w:r>
+        <w:t> </w:t>
+      </w:r>
+      <w:r>
+        <w:br/>
+      </w:r>
+      <w:r>
+        <w:t>Formulated and developed a real-time public transit system utilizing a smart backend stack (Python, Django/</w:t>
+      </w:r>
+      <w:proofErr w:type="spellStart"/>
+      <w:r>
+        <w:t>FastAPI</w:t>
+      </w:r>
+      <w:proofErr w:type="spellEnd"/>
+      <w:r>
+        <w:t xml:space="preserve">, React) containing live seat mapping and SOS emergency </w:t>
       </w:r>
       <w:proofErr w:type="gramStart"/>
       <w:r>
-        <w:t>assessment[</w:t>
+        <w:t>routing</w:t>
+      </w:r>
+      <w:r>
+        <w:t xml:space="preserve"> </w:t>
+      </w:r>
+      <w:r>
+        <w:t>.</w:t>
       </w:r>
       <w:proofErr w:type="gramEnd"/>
-      <w:r>
-        <w:t>cite: 45, 46].</w:t>
-      </w:r>
-    </w:p>
-    <w:p>
-      <w:pPr>
-        <w:numPr>
-          <w:ilvl w:val="0"/>
-          <w:numId w:val="8"/>
-        </w:numPr>
-      </w:pPr>
-      <w:r>
-        <w:rPr>
-          <w:b/>
-          <w:bCs/>
-        </w:rPr>
-        <w:t>Caesar Cipher Tool:</w:t>
-      </w:r>
-      <w:r>
-        <w:t xml:space="preserve"> Created an interactive encryption module handling shifting algorithms for text </w:t>
-      </w:r>
-      <w:proofErr w:type="gramStart"/>
-      <w:r>
-        <w:t>variations[</w:t>
-      </w:r>
-      <w:proofErr w:type="gramEnd"/>
-      <w:r>
-        <w:t>cite: 36, 37].</w:t>
-      </w:r>
     </w:p>
     <w:p>
       <w:pPr>
@@ -902,13 +853,13 @@
           <w:b/>
           <w:bCs/>
         </w:rPr>
-        <w:t>Accomplishments &amp; Hackathons</w:t>
+        <w:t>Certifications</w:t>
       </w:r>
     </w:p>
     <w:p>
       <w:r>
-        <w:pict w14:anchorId="549A52AA">
-          <v:rect id="_x0000_i1078" style="width:0;height:1.5pt" o:hralign="center" o:hrstd="t" o:hr="t" fillcolor="#a0a0a0" stroked="f"/>
+        <w:pict w14:anchorId="34DC4850">
+          <v:rect id="_x0000_i1032" style="width:0;height:1.5pt" o:hralign="center" o:hrstd="t" o:hr="t" fillcolor="#a0a0a0" stroked="f"/>
         </w:pict>
       </w:r>
     </w:p>
@@ -917,166 +868,81 @@
         <w:pStyle w:val="ListParagraph"/>
         <w:numPr>
           <w:ilvl w:val="0"/>
-          <w:numId w:val="18"/>
+          <w:numId w:val="22"/>
         </w:numPr>
       </w:pPr>
       <w:r>
-        <w:rPr>
-          <w:b/>
-          <w:bCs/>
-        </w:rPr>
-        <w:t>Internal Smart India Hackathon 2025:</w:t>
-      </w:r>
-      <w:r>
-        <w:t> </w:t>
-      </w:r>
-      <w:r>
-        <w:br/>
-      </w:r>
-      <w:r>
-        <w:t>Formulated and developed a real-time public transit system utilizing a smart backend stack (Python, Django/</w:t>
+        <w:t xml:space="preserve">Android </w:t>
+      </w:r>
+      <w:r>
+        <w:t>A</w:t>
+      </w:r>
+      <w:r>
+        <w:t>pp</w:t>
+      </w:r>
+      <w:r>
+        <w:t xml:space="preserve"> </w:t>
       </w:r>
       <w:proofErr w:type="spellStart"/>
       <w:r>
-        <w:t>FastAPI</w:t>
+        <w:t>Devlopment</w:t>
       </w:r>
       <w:proofErr w:type="spellEnd"/>
       <w:r>
-        <w:t xml:space="preserve">, React) containing live seat mapping and SOS emergency </w:t>
-      </w:r>
-      <w:proofErr w:type="gramStart"/>
-      <w:r>
-        <w:t>routing</w:t>
-      </w:r>
-      <w:r>
-        <w:t xml:space="preserve"> </w:t>
-      </w:r>
-      <w:r>
-        <w:t>.</w:t>
-      </w:r>
-      <w:proofErr w:type="gramEnd"/>
+        <w:t xml:space="preserve"> in core java – </w:t>
+      </w:r>
+      <w:proofErr w:type="spellStart"/>
+      <w:r>
+        <w:t>Netcamp</w:t>
+      </w:r>
+      <w:proofErr w:type="spellEnd"/>
     </w:p>
     <w:p>
       <w:pPr>
-        <w:jc w:val="center"/>
-        <w:rPr>
-          <w:b/>
-          <w:bCs/>
-        </w:rPr>
-      </w:pPr>
-      <w:r>
-        <w:rPr>
-          <w:b/>
-          <w:bCs/>
-        </w:rPr>
-        <w:t>Leadership &amp; Responsibilities</w:t>
-      </w:r>
+        <w:pStyle w:val="ListParagraph"/>
+        <w:numPr>
+          <w:ilvl w:val="0"/>
+          <w:numId w:val="22"/>
+        </w:numPr>
+      </w:pPr>
+      <w:r>
+        <w:t xml:space="preserve">Web </w:t>
+      </w:r>
+      <w:proofErr w:type="spellStart"/>
+      <w:r>
+        <w:t>Devlopment</w:t>
+      </w:r>
+      <w:proofErr w:type="spellEnd"/>
+      <w:r>
+        <w:t xml:space="preserve"> </w:t>
+      </w:r>
+      <w:r>
+        <w:t xml:space="preserve">with Ethical Hacking – </w:t>
+      </w:r>
+      <w:proofErr w:type="spellStart"/>
+      <w:r>
+        <w:t>Netcamp</w:t>
+      </w:r>
+      <w:proofErr w:type="spellEnd"/>
     </w:p>
     <w:p>
       <w:pPr>
-        <w:rPr>
-          <w:b/>
-          <w:bCs/>
-        </w:rPr>
-      </w:pPr>
-      <w:r>
-        <w:pict w14:anchorId="3F62301B">
-          <v:rect id="_x0000_i1094" style="width:0;height:1.5pt" o:hralign="center" o:hrstd="t" o:hr="t" fillcolor="#a0a0a0" stroked="f"/>
-        </w:pict>
-      </w:r>
-      <w:r>
-        <w:rPr>
-          <w:b/>
-          <w:bCs/>
-        </w:rPr>
-        <w:t xml:space="preserve">  </w:t>
-      </w:r>
-      <w:r>
-        <w:rPr>
-          <w:b/>
-          <w:bCs/>
-        </w:rPr>
-        <w:t xml:space="preserve">  </w:t>
-      </w:r>
-    </w:p>
-    <w:p>
-      <w:pPr>
-        <w:rPr>
-          <w:b/>
-          <w:bCs/>
-        </w:rPr>
-      </w:pPr>
-      <w:r>
-        <w:rPr>
-          <w:b/>
-          <w:bCs/>
-        </w:rPr>
-        <w:t>Internal Smart India Hackathon (</w:t>
-      </w:r>
-      <w:r>
-        <w:t xml:space="preserve">Aug 2025 </w:t>
-      </w:r>
-      <w:r>
-        <w:t>)</w:t>
-      </w:r>
-    </w:p>
-    <w:p>
-      <w:pPr>
-        <w:jc w:val="center"/>
-        <w:rPr>
-          <w:b/>
-          <w:bCs/>
-        </w:rPr>
-      </w:pPr>
-      <w:r>
-        <w:rPr>
-          <w:b/>
-          <w:bCs/>
-        </w:rPr>
-        <w:t>Certifications</w:t>
-      </w:r>
-    </w:p>
-    <w:p>
-      <w:r>
-        <w:pict w14:anchorId="34DC4850">
-          <v:rect id="_x0000_i1080" style="width:0;height:1.5pt" o:hralign="center" o:hrstd="t" o:hr="t" fillcolor="#a0a0a0" stroked="f"/>
-        </w:pict>
-      </w:r>
-    </w:p>
-    <w:p>
-      <w:pPr>
+        <w:pStyle w:val="ListParagraph"/>
         <w:numPr>
           <w:ilvl w:val="0"/>
-          <w:numId w:val="13"/>
+          <w:numId w:val="22"/>
         </w:numPr>
       </w:pPr>
       <w:r>
-        <w:t>Google Cybersecurity Professional Certificate — Coursera [cite: 77]</w:t>
+        <w:t>Python (Basic)</w:t>
+      </w:r>
+      <w:r>
+        <w:t xml:space="preserve"> – Hacker Rank</w:t>
+      </w:r>
+      <w:r>
+        <w:t xml:space="preserve"> </w:t>
       </w:r>
     </w:p>
-    <w:p>
-      <w:pPr>
-        <w:numPr>
-          <w:ilvl w:val="0"/>
-          <w:numId w:val="13"/>
-        </w:numPr>
-      </w:pPr>
-      <w:r>
-        <w:t>Ethical Hacking from Scratch — Udemy [cite: 78]</w:t>
-      </w:r>
-    </w:p>
-    <w:p>
-      <w:pPr>
-        <w:numPr>
-          <w:ilvl w:val="0"/>
-          <w:numId w:val="13"/>
-        </w:numPr>
-      </w:pPr>
-      <w:r>
-        <w:t>Introduction to Cybersecurity — Infosys Springboard [cite: 79</w:t>
-      </w:r>
-    </w:p>
-    <w:p/>
     <w:sectPr>
       <w:pgSz w:w="11906" w:h="16838"/>
       <w:pgMar w:top="1440" w:right="1440" w:bottom="1440" w:left="1440" w:header="708" w:footer="708" w:gutter="0"/>
@@ -1686,6 +1552,119 @@
     </w:lvl>
   </w:abstractNum>
   <w:abstractNum w:abstractNumId="4" w15:restartNumberingAfterBreak="0">
+    <w:nsid w:val="11935B29"/>
+    <w:multiLevelType w:val="hybridMultilevel"/>
+    <w:tmpl w:val="EFE230E2"/>
+    <w:lvl w:ilvl="0" w:tplc="40090001">
+      <w:start w:val="1"/>
+      <w:numFmt w:val="bullet"/>
+      <w:lvlText w:val=""/>
+      <w:lvlJc w:val="left"/>
+      <w:pPr>
+        <w:ind w:left="720" w:hanging="360"/>
+      </w:pPr>
+      <w:rPr>
+        <w:rFonts w:ascii="Symbol" w:hAnsi="Symbol" w:hint="default"/>
+      </w:rPr>
+    </w:lvl>
+    <w:lvl w:ilvl="1" w:tplc="40090003" w:tentative="1">
+      <w:start w:val="1"/>
+      <w:numFmt w:val="bullet"/>
+      <w:lvlText w:val="o"/>
+      <w:lvlJc w:val="left"/>
+      <w:pPr>
+        <w:ind w:left="1440" w:hanging="360"/>
+      </w:pPr>
+      <w:rPr>
+        <w:rFonts w:ascii="Courier New" w:hAnsi="Courier New" w:cs="Courier New" w:hint="default"/>
+      </w:rPr>
+    </w:lvl>
+    <w:lvl w:ilvl="2" w:tplc="40090005" w:tentative="1">
+      <w:start w:val="1"/>
+      <w:numFmt w:val="bullet"/>
+      <w:lvlText w:val=""/>
+      <w:lvlJc w:val="left"/>
+      <w:pPr>
+        <w:ind w:left="2160" w:hanging="360"/>
+      </w:pPr>
+      <w:rPr>
+        <w:rFonts w:ascii="Wingdings" w:hAnsi="Wingdings" w:hint="default"/>
+      </w:rPr>
+    </w:lvl>
+    <w:lvl w:ilvl="3" w:tplc="40090001" w:tentative="1">
+      <w:start w:val="1"/>
+      <w:numFmt w:val="bullet"/>
+      <w:lvlText w:val=""/>
+      <w:lvlJc w:val="left"/>
+      <w:pPr>
+        <w:ind w:left="2880" w:hanging="360"/>
+      </w:pPr>
+      <w:rPr>
+        <w:rFonts w:ascii="Symbol" w:hAnsi="Symbol" w:hint="default"/>
+      </w:rPr>
+    </w:lvl>
+    <w:lvl w:ilvl="4" w:tplc="40090003" w:tentative="1">
+      <w:start w:val="1"/>
+      <w:numFmt w:val="bullet"/>
+      <w:lvlText w:val="o"/>
+      <w:lvlJc w:val="left"/>
+      <w:pPr>
+        <w:ind w:left="3600" w:hanging="360"/>
+      </w:pPr>
+      <w:rPr>
+        <w:rFonts w:ascii="Courier New" w:hAnsi="Courier New" w:cs="Courier New" w:hint="default"/>
+      </w:rPr>
+    </w:lvl>
+    <w:lvl w:ilvl="5" w:tplc="40090005" w:tentative="1">
+      <w:start w:val="1"/>
+      <w:numFmt w:val="bullet"/>
+      <w:lvlText w:val=""/>
+      <w:lvlJc w:val="left"/>
+      <w:pPr>
+        <w:ind w:left="4320" w:hanging="360"/>
+      </w:pPr>
+      <w:rPr>
+        <w:rFonts w:ascii="Wingdings" w:hAnsi="Wingdings" w:hint="default"/>
+      </w:rPr>
+    </w:lvl>
+    <w:lvl w:ilvl="6" w:tplc="40090001" w:tentative="1">
+      <w:start w:val="1"/>
+      <w:numFmt w:val="bullet"/>
+      <w:lvlText w:val=""/>
+      <w:lvlJc w:val="left"/>
+      <w:pPr>
+        <w:ind w:left="5040" w:hanging="360"/>
+      </w:pPr>
+      <w:rPr>
+        <w:rFonts w:ascii="Symbol" w:hAnsi="Symbol" w:hint="default"/>
+      </w:rPr>
+    </w:lvl>
+    <w:lvl w:ilvl="7" w:tplc="40090003" w:tentative="1">
+      <w:start w:val="1"/>
+      <w:numFmt w:val="bullet"/>
+      <w:lvlText w:val="o"/>
+      <w:lvlJc w:val="left"/>
+      <w:pPr>
+        <w:ind w:left="5760" w:hanging="360"/>
+      </w:pPr>
+      <w:rPr>
+        <w:rFonts w:ascii="Courier New" w:hAnsi="Courier New" w:cs="Courier New" w:hint="default"/>
+      </w:rPr>
+    </w:lvl>
+    <w:lvl w:ilvl="8" w:tplc="40090005" w:tentative="1">
+      <w:start w:val="1"/>
+      <w:numFmt w:val="bullet"/>
+      <w:lvlText w:val=""/>
+      <w:lvlJc w:val="left"/>
+      <w:pPr>
+        <w:ind w:left="6480" w:hanging="360"/>
+      </w:pPr>
+      <w:rPr>
+        <w:rFonts w:ascii="Wingdings" w:hAnsi="Wingdings" w:hint="default"/>
+      </w:rPr>
+    </w:lvl>
+  </w:abstractNum>
+  <w:abstractNum w:abstractNumId="5" w15:restartNumberingAfterBreak="0">
     <w:nsid w:val="13E27661"/>
     <w:multiLevelType w:val="multilevel"/>
     <w:tmpl w:val="6E96D8D0"/>
@@ -1834,7 +1813,120 @@
       </w:rPr>
     </w:lvl>
   </w:abstractNum>
-  <w:abstractNum w:abstractNumId="5" w15:restartNumberingAfterBreak="0">
+  <w:abstractNum w:abstractNumId="6" w15:restartNumberingAfterBreak="0">
+    <w:nsid w:val="1C522C49"/>
+    <w:multiLevelType w:val="hybridMultilevel"/>
+    <w:tmpl w:val="2DF0BC22"/>
+    <w:lvl w:ilvl="0" w:tplc="40090005">
+      <w:start w:val="1"/>
+      <w:numFmt w:val="bullet"/>
+      <w:lvlText w:val=""/>
+      <w:lvlJc w:val="left"/>
+      <w:pPr>
+        <w:ind w:left="720" w:hanging="360"/>
+      </w:pPr>
+      <w:rPr>
+        <w:rFonts w:ascii="Wingdings" w:hAnsi="Wingdings" w:hint="default"/>
+      </w:rPr>
+    </w:lvl>
+    <w:lvl w:ilvl="1" w:tplc="40090003" w:tentative="1">
+      <w:start w:val="1"/>
+      <w:numFmt w:val="bullet"/>
+      <w:lvlText w:val="o"/>
+      <w:lvlJc w:val="left"/>
+      <w:pPr>
+        <w:ind w:left="1440" w:hanging="360"/>
+      </w:pPr>
+      <w:rPr>
+        <w:rFonts w:ascii="Courier New" w:hAnsi="Courier New" w:cs="Courier New" w:hint="default"/>
+      </w:rPr>
+    </w:lvl>
+    <w:lvl w:ilvl="2" w:tplc="40090005" w:tentative="1">
+      <w:start w:val="1"/>
+      <w:numFmt w:val="bullet"/>
+      <w:lvlText w:val=""/>
+      <w:lvlJc w:val="left"/>
+      <w:pPr>
+        <w:ind w:left="2160" w:hanging="360"/>
+      </w:pPr>
+      <w:rPr>
+        <w:rFonts w:ascii="Wingdings" w:hAnsi="Wingdings" w:hint="default"/>
+      </w:rPr>
+    </w:lvl>
+    <w:lvl w:ilvl="3" w:tplc="40090001" w:tentative="1">
+      <w:start w:val="1"/>
+      <w:numFmt w:val="bullet"/>
+      <w:lvlText w:val=""/>
+      <w:lvlJc w:val="left"/>
+      <w:pPr>
+        <w:ind w:left="2880" w:hanging="360"/>
+      </w:pPr>
+      <w:rPr>
+        <w:rFonts w:ascii="Symbol" w:hAnsi="Symbol" w:hint="default"/>
+      </w:rPr>
+    </w:lvl>
+    <w:lvl w:ilvl="4" w:tplc="40090003" w:tentative="1">
+      <w:start w:val="1"/>
+      <w:numFmt w:val="bullet"/>
+      <w:lvlText w:val="o"/>
+      <w:lvlJc w:val="left"/>
+      <w:pPr>
+        <w:ind w:left="3600" w:hanging="360"/>
+      </w:pPr>
+      <w:rPr>
+        <w:rFonts w:ascii="Courier New" w:hAnsi="Courier New" w:cs="Courier New" w:hint="default"/>
+      </w:rPr>
+    </w:lvl>
+    <w:lvl w:ilvl="5" w:tplc="40090005" w:tentative="1">
+      <w:start w:val="1"/>
+      <w:numFmt w:val="bullet"/>
+      <w:lvlText w:val=""/>
+      <w:lvlJc w:val="left"/>
+      <w:pPr>
+        <w:ind w:left="4320" w:hanging="360"/>
+      </w:pPr>
+      <w:rPr>
+        <w:rFonts w:ascii="Wingdings" w:hAnsi="Wingdings" w:hint="default"/>
+      </w:rPr>
+    </w:lvl>
+    <w:lvl w:ilvl="6" w:tplc="40090001" w:tentative="1">
+      <w:start w:val="1"/>
+      <w:numFmt w:val="bullet"/>
+      <w:lvlText w:val=""/>
+      <w:lvlJc w:val="left"/>
+      <w:pPr>
+        <w:ind w:left="5040" w:hanging="360"/>
+      </w:pPr>
+      <w:rPr>
+        <w:rFonts w:ascii="Symbol" w:hAnsi="Symbol" w:hint="default"/>
+      </w:rPr>
+    </w:lvl>
+    <w:lvl w:ilvl="7" w:tplc="40090003" w:tentative="1">
+      <w:start w:val="1"/>
+      <w:numFmt w:val="bullet"/>
+      <w:lvlText w:val="o"/>
+      <w:lvlJc w:val="left"/>
+      <w:pPr>
+        <w:ind w:left="5760" w:hanging="360"/>
+      </w:pPr>
+      <w:rPr>
+        <w:rFonts w:ascii="Courier New" w:hAnsi="Courier New" w:cs="Courier New" w:hint="default"/>
+      </w:rPr>
+    </w:lvl>
+    <w:lvl w:ilvl="8" w:tplc="40090005" w:tentative="1">
+      <w:start w:val="1"/>
+      <w:numFmt w:val="bullet"/>
+      <w:lvlText w:val=""/>
+      <w:lvlJc w:val="left"/>
+      <w:pPr>
+        <w:ind w:left="6480" w:hanging="360"/>
+      </w:pPr>
+      <w:rPr>
+        <w:rFonts w:ascii="Wingdings" w:hAnsi="Wingdings" w:hint="default"/>
+      </w:rPr>
+    </w:lvl>
+  </w:abstractNum>
+  <w:abstractNum w:abstractNumId="7" w15:restartNumberingAfterBreak="0">
     <w:nsid w:val="1EF31A97"/>
     <w:multiLevelType w:val="multilevel"/>
     <w:tmpl w:val="AA7E4550"/>
@@ -1983,7 +2075,7 @@
       </w:rPr>
     </w:lvl>
   </w:abstractNum>
-  <w:abstractNum w:abstractNumId="6" w15:restartNumberingAfterBreak="0">
+  <w:abstractNum w:abstractNumId="8" w15:restartNumberingAfterBreak="0">
     <w:nsid w:val="2A3323FF"/>
     <w:multiLevelType w:val="hybridMultilevel"/>
     <w:tmpl w:val="3968DE48"/>
@@ -2096,7 +2188,7 @@
       </w:rPr>
     </w:lvl>
   </w:abstractNum>
-  <w:abstractNum w:abstractNumId="7" w15:restartNumberingAfterBreak="0">
+  <w:abstractNum w:abstractNumId="9" w15:restartNumberingAfterBreak="0">
     <w:nsid w:val="2E6052CE"/>
     <w:multiLevelType w:val="multilevel"/>
     <w:tmpl w:val="D6620B62"/>
@@ -2245,7 +2337,7 @@
       </w:rPr>
     </w:lvl>
   </w:abstractNum>
-  <w:abstractNum w:abstractNumId="8" w15:restartNumberingAfterBreak="0">
+  <w:abstractNum w:abstractNumId="10" w15:restartNumberingAfterBreak="0">
     <w:nsid w:val="31D32043"/>
     <w:multiLevelType w:val="multilevel"/>
     <w:tmpl w:val="D21627E0"/>
@@ -2394,7 +2486,7 @@
       </w:rPr>
     </w:lvl>
   </w:abstractNum>
-  <w:abstractNum w:abstractNumId="9" w15:restartNumberingAfterBreak="0">
+  <w:abstractNum w:abstractNumId="11" w15:restartNumberingAfterBreak="0">
     <w:nsid w:val="388806CC"/>
     <w:multiLevelType w:val="multilevel"/>
     <w:tmpl w:val="E9A02FE8"/>
@@ -2543,7 +2635,7 @@
       </w:rPr>
     </w:lvl>
   </w:abstractNum>
-  <w:abstractNum w:abstractNumId="10" w15:restartNumberingAfterBreak="0">
+  <w:abstractNum w:abstractNumId="12" w15:restartNumberingAfterBreak="0">
     <w:nsid w:val="3BD7758B"/>
     <w:multiLevelType w:val="hybridMultilevel"/>
     <w:tmpl w:val="2D5A5CA6"/>
@@ -2656,7 +2748,120 @@
       </w:rPr>
     </w:lvl>
   </w:abstractNum>
-  <w:abstractNum w:abstractNumId="11" w15:restartNumberingAfterBreak="0">
+  <w:abstractNum w:abstractNumId="13" w15:restartNumberingAfterBreak="0">
+    <w:nsid w:val="3E712D3D"/>
+    <w:multiLevelType w:val="hybridMultilevel"/>
+    <w:tmpl w:val="52A85E82"/>
+    <w:lvl w:ilvl="0" w:tplc="40090005">
+      <w:start w:val="1"/>
+      <w:numFmt w:val="bullet"/>
+      <w:lvlText w:val=""/>
+      <w:lvlJc w:val="left"/>
+      <w:pPr>
+        <w:ind w:left="720" w:hanging="360"/>
+      </w:pPr>
+      <w:rPr>
+        <w:rFonts w:ascii="Wingdings" w:hAnsi="Wingdings" w:hint="default"/>
+      </w:rPr>
+    </w:lvl>
+    <w:lvl w:ilvl="1" w:tplc="40090003" w:tentative="1">
+      <w:start w:val="1"/>
+      <w:numFmt w:val="bullet"/>
+      <w:lvlText w:val="o"/>
+      <w:lvlJc w:val="left"/>
+      <w:pPr>
+        <w:ind w:left="1440" w:hanging="360"/>
+      </w:pPr>
+      <w:rPr>
+        <w:rFonts w:ascii="Courier New" w:hAnsi="Courier New" w:cs="Courier New" w:hint="default"/>
+      </w:rPr>
+    </w:lvl>
+    <w:lvl w:ilvl="2" w:tplc="40090005" w:tentative="1">
+      <w:start w:val="1"/>
+      <w:numFmt w:val="bullet"/>
+      <w:lvlText w:val=""/>
+      <w:lvlJc w:val="left"/>
+      <w:pPr>
+        <w:ind w:left="2160" w:hanging="360"/>
+      </w:pPr>
+      <w:rPr>
+        <w:rFonts w:ascii="Wingdings" w:hAnsi="Wingdings" w:hint="default"/>
+      </w:rPr>
+    </w:lvl>
+    <w:lvl w:ilvl="3" w:tplc="40090001" w:tentative="1">
+      <w:start w:val="1"/>
+      <w:numFmt w:val="bullet"/>
+      <w:lvlText w:val=""/>
+      <w:lvlJc w:val="left"/>
+      <w:pPr>
+        <w:ind w:left="2880" w:hanging="360"/>
+      </w:pPr>
+      <w:rPr>
+        <w:rFonts w:ascii="Symbol" w:hAnsi="Symbol" w:hint="default"/>
+      </w:rPr>
+    </w:lvl>
+    <w:lvl w:ilvl="4" w:tplc="40090003" w:tentative="1">
+      <w:start w:val="1"/>
+      <w:numFmt w:val="bullet"/>
+      <w:lvlText w:val="o"/>
+      <w:lvlJc w:val="left"/>
+      <w:pPr>
+        <w:ind w:left="3600" w:hanging="360"/>
+      </w:pPr>
+      <w:rPr>
+        <w:rFonts w:ascii="Courier New" w:hAnsi="Courier New" w:cs="Courier New" w:hint="default"/>
+      </w:rPr>
+    </w:lvl>
+    <w:lvl w:ilvl="5" w:tplc="40090005" w:tentative="1">
+      <w:start w:val="1"/>
+      <w:numFmt w:val="bullet"/>
+      <w:lvlText w:val=""/>
+      <w:lvlJc w:val="left"/>
+      <w:pPr>
+        <w:ind w:left="4320" w:hanging="360"/>
+      </w:pPr>
+      <w:rPr>
+        <w:rFonts w:ascii="Wingdings" w:hAnsi="Wingdings" w:hint="default"/>
+      </w:rPr>
+    </w:lvl>
+    <w:lvl w:ilvl="6" w:tplc="40090001" w:tentative="1">
+      <w:start w:val="1"/>
+      <w:numFmt w:val="bullet"/>
+      <w:lvlText w:val=""/>
+      <w:lvlJc w:val="left"/>
+      <w:pPr>
+        <w:ind w:left="5040" w:hanging="360"/>
+      </w:pPr>
+      <w:rPr>
+        <w:rFonts w:ascii="Symbol" w:hAnsi="Symbol" w:hint="default"/>
+      </w:rPr>
+    </w:lvl>
+    <w:lvl w:ilvl="7" w:tplc="40090003" w:tentative="1">
+      <w:start w:val="1"/>
+      <w:numFmt w:val="bullet"/>
+      <w:lvlText w:val="o"/>
+      <w:lvlJc w:val="left"/>
+      <w:pPr>
+        <w:ind w:left="5760" w:hanging="360"/>
+      </w:pPr>
+      <w:rPr>
+        <w:rFonts w:ascii="Courier New" w:hAnsi="Courier New" w:cs="Courier New" w:hint="default"/>
+      </w:rPr>
+    </w:lvl>
+    <w:lvl w:ilvl="8" w:tplc="40090005" w:tentative="1">
+      <w:start w:val="1"/>
+      <w:numFmt w:val="bullet"/>
+      <w:lvlText w:val=""/>
+      <w:lvlJc w:val="left"/>
+      <w:pPr>
+        <w:ind w:left="6480" w:hanging="360"/>
+      </w:pPr>
+      <w:rPr>
+        <w:rFonts w:ascii="Wingdings" w:hAnsi="Wingdings" w:hint="default"/>
+      </w:rPr>
+    </w:lvl>
+  </w:abstractNum>
+  <w:abstractNum w:abstractNumId="14" w15:restartNumberingAfterBreak="0">
     <w:nsid w:val="404B3345"/>
     <w:multiLevelType w:val="hybridMultilevel"/>
     <w:tmpl w:val="2AB235A6"/>
@@ -2769,7 +2974,7 @@
       </w:rPr>
     </w:lvl>
   </w:abstractNum>
-  <w:abstractNum w:abstractNumId="12" w15:restartNumberingAfterBreak="0">
+  <w:abstractNum w:abstractNumId="15" w15:restartNumberingAfterBreak="0">
     <w:nsid w:val="45755CEE"/>
     <w:multiLevelType w:val="hybridMultilevel"/>
     <w:tmpl w:val="C1F4242A"/>
@@ -2882,7 +3087,7 @@
       </w:rPr>
     </w:lvl>
   </w:abstractNum>
-  <w:abstractNum w:abstractNumId="13" w15:restartNumberingAfterBreak="0">
+  <w:abstractNum w:abstractNumId="16" w15:restartNumberingAfterBreak="0">
     <w:nsid w:val="46532018"/>
     <w:multiLevelType w:val="multilevel"/>
     <w:tmpl w:val="01F6928E"/>
@@ -3031,7 +3236,120 @@
       </w:rPr>
     </w:lvl>
   </w:abstractNum>
-  <w:abstractNum w:abstractNumId="14" w15:restartNumberingAfterBreak="0">
+  <w:abstractNum w:abstractNumId="17" w15:restartNumberingAfterBreak="0">
+    <w:nsid w:val="49383211"/>
+    <w:multiLevelType w:val="hybridMultilevel"/>
+    <w:tmpl w:val="B58C43E0"/>
+    <w:lvl w:ilvl="0" w:tplc="40090005">
+      <w:start w:val="1"/>
+      <w:numFmt w:val="bullet"/>
+      <w:lvlText w:val=""/>
+      <w:lvlJc w:val="left"/>
+      <w:pPr>
+        <w:ind w:left="720" w:hanging="360"/>
+      </w:pPr>
+      <w:rPr>
+        <w:rFonts w:ascii="Wingdings" w:hAnsi="Wingdings" w:hint="default"/>
+      </w:rPr>
+    </w:lvl>
+    <w:lvl w:ilvl="1" w:tplc="FFFFFFFF" w:tentative="1">
+      <w:start w:val="1"/>
+      <w:numFmt w:val="bullet"/>
+      <w:lvlText w:val="o"/>
+      <w:lvlJc w:val="left"/>
+      <w:pPr>
+        <w:ind w:left="1440" w:hanging="360"/>
+      </w:pPr>
+      <w:rPr>
+        <w:rFonts w:ascii="Courier New" w:hAnsi="Courier New" w:cs="Courier New" w:hint="default"/>
+      </w:rPr>
+    </w:lvl>
+    <w:lvl w:ilvl="2" w:tplc="FFFFFFFF" w:tentative="1">
+      <w:start w:val="1"/>
+      <w:numFmt w:val="bullet"/>
+      <w:lvlText w:val=""/>
+      <w:lvlJc w:val="left"/>
+      <w:pPr>
+        <w:ind w:left="2160" w:hanging="360"/>
+      </w:pPr>
+      <w:rPr>
+        <w:rFonts w:ascii="Wingdings" w:hAnsi="Wingdings" w:hint="default"/>
+      </w:rPr>
+    </w:lvl>
+    <w:lvl w:ilvl="3" w:tplc="FFFFFFFF" w:tentative="1">
+      <w:start w:val="1"/>
+      <w:numFmt w:val="bullet"/>
+      <w:lvlText w:val=""/>
+      <w:lvlJc w:val="left"/>
+      <w:pPr>
+        <w:ind w:left="2880" w:hanging="360"/>
+      </w:pPr>
+      <w:rPr>
+        <w:rFonts w:ascii="Symbol" w:hAnsi="Symbol" w:hint="default"/>
+      </w:rPr>
+    </w:lvl>
+    <w:lvl w:ilvl="4" w:tplc="FFFFFFFF" w:tentative="1">
+      <w:start w:val="1"/>
+      <w:numFmt w:val="bullet"/>
+      <w:lvlText w:val="o"/>
+      <w:lvlJc w:val="left"/>
+      <w:pPr>
+        <w:ind w:left="3600" w:hanging="360"/>
+      </w:pPr>
+      <w:rPr>
+        <w:rFonts w:ascii="Courier New" w:hAnsi="Courier New" w:cs="Courier New" w:hint="default"/>
+      </w:rPr>
+    </w:lvl>
+    <w:lvl w:ilvl="5" w:tplc="FFFFFFFF" w:tentative="1">
+      <w:start w:val="1"/>
+      <w:numFmt w:val="bullet"/>
+      <w:lvlText w:val=""/>
+      <w:lvlJc w:val="left"/>
+      <w:pPr>
+        <w:ind w:left="4320" w:hanging="360"/>
+      </w:pPr>
+      <w:rPr>
+        <w:rFonts w:ascii="Wingdings" w:hAnsi="Wingdings" w:hint="default"/>
+      </w:rPr>
+    </w:lvl>
+    <w:lvl w:ilvl="6" w:tplc="FFFFFFFF" w:tentative="1">
+      <w:start w:val="1"/>
+      <w:numFmt w:val="bullet"/>
+      <w:lvlText w:val=""/>
+      <w:lvlJc w:val="left"/>
+      <w:pPr>
+        <w:ind w:left="5040" w:hanging="360"/>
+      </w:pPr>
+      <w:rPr>
+        <w:rFonts w:ascii="Symbol" w:hAnsi="Symbol" w:hint="default"/>
+      </w:rPr>
+    </w:lvl>
+    <w:lvl w:ilvl="7" w:tplc="FFFFFFFF" w:tentative="1">
+      <w:start w:val="1"/>
+      <w:numFmt w:val="bullet"/>
+      <w:lvlText w:val="o"/>
+      <w:lvlJc w:val="left"/>
+      <w:pPr>
+        <w:ind w:left="5760" w:hanging="360"/>
+      </w:pPr>
+      <w:rPr>
+        <w:rFonts w:ascii="Courier New" w:hAnsi="Courier New" w:cs="Courier New" w:hint="default"/>
+      </w:rPr>
+    </w:lvl>
+    <w:lvl w:ilvl="8" w:tplc="FFFFFFFF" w:tentative="1">
+      <w:start w:val="1"/>
+      <w:numFmt w:val="bullet"/>
+      <w:lvlText w:val=""/>
+      <w:lvlJc w:val="left"/>
+      <w:pPr>
+        <w:ind w:left="6480" w:hanging="360"/>
+      </w:pPr>
+      <w:rPr>
+        <w:rFonts w:ascii="Wingdings" w:hAnsi="Wingdings" w:hint="default"/>
+      </w:rPr>
+    </w:lvl>
+  </w:abstractNum>
+  <w:abstractNum w:abstractNumId="18" w15:restartNumberingAfterBreak="0">
     <w:nsid w:val="4DE352F4"/>
     <w:multiLevelType w:val="multilevel"/>
     <w:tmpl w:val="458EB0C8"/>
@@ -3180,7 +3498,120 @@
       </w:rPr>
     </w:lvl>
   </w:abstractNum>
-  <w:abstractNum w:abstractNumId="15" w15:restartNumberingAfterBreak="0">
+  <w:abstractNum w:abstractNumId="19" w15:restartNumberingAfterBreak="0">
+    <w:nsid w:val="5DF53885"/>
+    <w:multiLevelType w:val="hybridMultilevel"/>
+    <w:tmpl w:val="2A2C3E5E"/>
+    <w:lvl w:ilvl="0" w:tplc="40090001">
+      <w:start w:val="1"/>
+      <w:numFmt w:val="bullet"/>
+      <w:lvlText w:val=""/>
+      <w:lvlJc w:val="left"/>
+      <w:pPr>
+        <w:ind w:left="720" w:hanging="360"/>
+      </w:pPr>
+      <w:rPr>
+        <w:rFonts w:ascii="Symbol" w:hAnsi="Symbol" w:hint="default"/>
+      </w:rPr>
+    </w:lvl>
+    <w:lvl w:ilvl="1" w:tplc="40090003" w:tentative="1">
+      <w:start w:val="1"/>
+      <w:numFmt w:val="bullet"/>
+      <w:lvlText w:val="o"/>
+      <w:lvlJc w:val="left"/>
+      <w:pPr>
+        <w:ind w:left="1440" w:hanging="360"/>
+      </w:pPr>
+      <w:rPr>
+        <w:rFonts w:ascii="Courier New" w:hAnsi="Courier New" w:cs="Courier New" w:hint="default"/>
+      </w:rPr>
+    </w:lvl>
+    <w:lvl w:ilvl="2" w:tplc="40090005" w:tentative="1">
+      <w:start w:val="1"/>
+      <w:numFmt w:val="bullet"/>
+      <w:lvlText w:val=""/>
+      <w:lvlJc w:val="left"/>
+      <w:pPr>
+        <w:ind w:left="2160" w:hanging="360"/>
+      </w:pPr>
+      <w:rPr>
+        <w:rFonts w:ascii="Wingdings" w:hAnsi="Wingdings" w:hint="default"/>
+      </w:rPr>
+    </w:lvl>
+    <w:lvl w:ilvl="3" w:tplc="40090001" w:tentative="1">
+      <w:start w:val="1"/>
+      <w:numFmt w:val="bullet"/>
+      <w:lvlText w:val=""/>
+      <w:lvlJc w:val="left"/>
+      <w:pPr>
+        <w:ind w:left="2880" w:hanging="360"/>
+      </w:pPr>
+      <w:rPr>
+        <w:rFonts w:ascii="Symbol" w:hAnsi="Symbol" w:hint="default"/>
+      </w:rPr>
+    </w:lvl>
+    <w:lvl w:ilvl="4" w:tplc="40090003" w:tentative="1">
+      <w:start w:val="1"/>
+      <w:numFmt w:val="bullet"/>
+      <w:lvlText w:val="o"/>
+      <w:lvlJc w:val="left"/>
+      <w:pPr>
+        <w:ind w:left="3600" w:hanging="360"/>
+      </w:pPr>
+      <w:rPr>
+        <w:rFonts w:ascii="Courier New" w:hAnsi="Courier New" w:cs="Courier New" w:hint="default"/>
+      </w:rPr>
+    </w:lvl>
+    <w:lvl w:ilvl="5" w:tplc="40090005" w:tentative="1">
+      <w:start w:val="1"/>
+      <w:numFmt w:val="bullet"/>
+      <w:lvlText w:val=""/>
+      <w:lvlJc w:val="left"/>
+      <w:pPr>
+        <w:ind w:left="4320" w:hanging="360"/>
+      </w:pPr>
+      <w:rPr>
+        <w:rFonts w:ascii="Wingdings" w:hAnsi="Wingdings" w:hint="default"/>
+      </w:rPr>
+    </w:lvl>
+    <w:lvl w:ilvl="6" w:tplc="40090001" w:tentative="1">
+      <w:start w:val="1"/>
+      <w:numFmt w:val="bullet"/>
+      <w:lvlText w:val=""/>
+      <w:lvlJc w:val="left"/>
+      <w:pPr>
+        <w:ind w:left="5040" w:hanging="360"/>
+      </w:pPr>
+      <w:rPr>
+        <w:rFonts w:ascii="Symbol" w:hAnsi="Symbol" w:hint="default"/>
+      </w:rPr>
+    </w:lvl>
+    <w:lvl w:ilvl="7" w:tplc="40090003" w:tentative="1">
+      <w:start w:val="1"/>
+      <w:numFmt w:val="bullet"/>
+      <w:lvlText w:val="o"/>
+      <w:lvlJc w:val="left"/>
+      <w:pPr>
+        <w:ind w:left="5760" w:hanging="360"/>
+      </w:pPr>
+      <w:rPr>
+        <w:rFonts w:ascii="Courier New" w:hAnsi="Courier New" w:cs="Courier New" w:hint="default"/>
+      </w:rPr>
+    </w:lvl>
+    <w:lvl w:ilvl="8" w:tplc="40090005" w:tentative="1">
+      <w:start w:val="1"/>
+      <w:numFmt w:val="bullet"/>
+      <w:lvlText w:val=""/>
+      <w:lvlJc w:val="left"/>
+      <w:pPr>
+        <w:ind w:left="6480" w:hanging="360"/>
+      </w:pPr>
+      <w:rPr>
+        <w:rFonts w:ascii="Wingdings" w:hAnsi="Wingdings" w:hint="default"/>
+      </w:rPr>
+    </w:lvl>
+  </w:abstractNum>
+  <w:abstractNum w:abstractNumId="20" w15:restartNumberingAfterBreak="0">
     <w:nsid w:val="6F6C4857"/>
     <w:multiLevelType w:val="multilevel"/>
     <w:tmpl w:val="E8745634"/>
@@ -3329,7 +3760,7 @@
       </w:rPr>
     </w:lvl>
   </w:abstractNum>
-  <w:abstractNum w:abstractNumId="16" w15:restartNumberingAfterBreak="0">
+  <w:abstractNum w:abstractNumId="21" w15:restartNumberingAfterBreak="0">
     <w:nsid w:val="75785AF4"/>
     <w:multiLevelType w:val="multilevel"/>
     <w:tmpl w:val="0172DB46"/>
@@ -3478,7 +3909,7 @@
       </w:rPr>
     </w:lvl>
   </w:abstractNum>
-  <w:abstractNum w:abstractNumId="17" w15:restartNumberingAfterBreak="0">
+  <w:abstractNum w:abstractNumId="22" w15:restartNumberingAfterBreak="0">
     <w:nsid w:val="77264449"/>
     <w:multiLevelType w:val="hybridMultilevel"/>
     <w:tmpl w:val="B674ED92"/>
@@ -3595,55 +4026,70 @@
     <w:abstractNumId w:val="1"/>
   </w:num>
   <w:num w:numId="2" w16cid:durableId="291711074">
-    <w:abstractNumId w:val="4"/>
+    <w:abstractNumId w:val="5"/>
   </w:num>
   <w:num w:numId="3" w16cid:durableId="1520125276">
-    <w:abstractNumId w:val="16"/>
+    <w:abstractNumId w:val="21"/>
   </w:num>
   <w:num w:numId="4" w16cid:durableId="54624186">
-    <w:abstractNumId w:val="7"/>
+    <w:abstractNumId w:val="9"/>
   </w:num>
   <w:num w:numId="5" w16cid:durableId="761873425">
-    <w:abstractNumId w:val="14"/>
+    <w:abstractNumId w:val="18"/>
   </w:num>
   <w:num w:numId="6" w16cid:durableId="47727357">
     <w:abstractNumId w:val="3"/>
   </w:num>
   <w:num w:numId="7" w16cid:durableId="1342196002">
-    <w:abstractNumId w:val="5"/>
+    <w:abstractNumId w:val="7"/>
   </w:num>
   <w:num w:numId="8" w16cid:durableId="1253468460">
-    <w:abstractNumId w:val="15"/>
+    <w:abstractNumId w:val="20"/>
   </w:num>
   <w:num w:numId="9" w16cid:durableId="579559571">
     <w:abstractNumId w:val="0"/>
   </w:num>
   <w:num w:numId="10" w16cid:durableId="570240354">
-    <w:abstractNumId w:val="9"/>
+    <w:abstractNumId w:val="11"/>
   </w:num>
   <w:num w:numId="11" w16cid:durableId="1895121638">
-    <w:abstractNumId w:val="13"/>
+    <w:abstractNumId w:val="16"/>
   </w:num>
   <w:num w:numId="12" w16cid:durableId="458577248">
-    <w:abstractNumId w:val="8"/>
+    <w:abstractNumId w:val="10"/>
   </w:num>
   <w:num w:numId="13" w16cid:durableId="2134783518">
     <w:abstractNumId w:val="2"/>
   </w:num>
   <w:num w:numId="14" w16cid:durableId="1536040915">
+    <w:abstractNumId w:val="8"/>
+  </w:num>
+  <w:num w:numId="15" w16cid:durableId="1236745224">
+    <w:abstractNumId w:val="15"/>
+  </w:num>
+  <w:num w:numId="16" w16cid:durableId="1644575068">
+    <w:abstractNumId w:val="12"/>
+  </w:num>
+  <w:num w:numId="17" w16cid:durableId="817457430">
+    <w:abstractNumId w:val="14"/>
+  </w:num>
+  <w:num w:numId="18" w16cid:durableId="1094203294">
+    <w:abstractNumId w:val="22"/>
+  </w:num>
+  <w:num w:numId="19" w16cid:durableId="1603877177">
+    <w:abstractNumId w:val="4"/>
+  </w:num>
+  <w:num w:numId="20" w16cid:durableId="1523595099">
+    <w:abstractNumId w:val="19"/>
+  </w:num>
+  <w:num w:numId="21" w16cid:durableId="1724253973">
+    <w:abstractNumId w:val="17"/>
+  </w:num>
+  <w:num w:numId="22" w16cid:durableId="1424644966">
     <w:abstractNumId w:val="6"/>
   </w:num>
-  <w:num w:numId="15" w16cid:durableId="1236745224">
-    <w:abstractNumId w:val="12"/>
-  </w:num>
-  <w:num w:numId="16" w16cid:durableId="1644575068">
-    <w:abstractNumId w:val="10"/>
-  </w:num>
-  <w:num w:numId="17" w16cid:durableId="817457430">
-    <w:abstractNumId w:val="11"/>
-  </w:num>
-  <w:num w:numId="18" w16cid:durableId="1094203294">
-    <w:abstractNumId w:val="17"/>
+  <w:num w:numId="23" w16cid:durableId="1762754293">
+    <w:abstractNumId w:val="13"/>
   </w:num>
 </w:numbering>
 </file>

</xml_diff>